<commit_message>
Cyber3 - Review amendments
</commit_message>
<xml_diff>
--- a/src/site/pdfs/cs3_u6_s2_assessment_personal_skills.docx
+++ b/src/site/pdfs/cs3_u6_s2_assessment_personal_skills.docx
@@ -1,6 +1,6 @@
 
 <file path=word/document.xml><?xml version="1.0" encoding="utf-8"?>
-<w:document xmlns:wpc="http://schemas.microsoft.com/office/word/2010/wordprocessingCanvas" xmlns:cx="http://schemas.microsoft.com/office/drawing/2014/chartex" xmlns:cx1="http://schemas.microsoft.com/office/drawing/2015/9/8/chartex" xmlns:cx2="http://schemas.microsoft.com/office/drawing/2015/10/21/chartex" xmlns:cx3="http://schemas.microsoft.com/office/drawing/2016/5/9/chartex" xmlns:cx4="http://schemas.microsoft.com/office/drawing/2016/5/10/chartex" xmlns:cx5="http://schemas.microsoft.com/office/drawing/2016/5/11/chartex" xmlns:cx6="http://schemas.microsoft.com/office/drawing/2016/5/12/chartex" xmlns:cx7="http://schemas.microsoft.com/office/drawing/2016/5/13/chartex" xmlns:cx8="http://schemas.microsoft.com/office/drawing/2016/5/14/chartex" xmlns:mc="http://schemas.openxmlformats.org/markup-compatibility/2006" xmlns:aink="http://schemas.microsoft.com/office/drawing/2016/ink" xmlns:am3d="http://schemas.microsoft.com/office/drawing/2017/model3d" xmlns:o="urn:schemas-microsoft-com:office:office" xmlns:oel="http://schemas.microsoft.com/office/2019/extlst" xmlns:r="http://schemas.openxmlformats.org/officeDocument/2006/relationships" xmlns:m="http://schemas.openxmlformats.org/officeDocument/2006/math" xmlns:v="urn:schemas-microsoft-com:vml" xmlns:wp14="http://schemas.microsoft.com/office/word/2010/wordprocessingDrawing" xmlns:wp="http://schemas.openxmlformats.org/drawingml/2006/wordprocessingDrawing" xmlns:w10="urn:schemas-microsoft-com:office:word" xmlns:w="http://schemas.openxmlformats.org/wordprocessingml/2006/main" xmlns:w14="http://schemas.microsoft.com/office/word/2010/wordml" xmlns:w15="http://schemas.microsoft.com/office/word/2012/wordml" xmlns:w16cex="http://schemas.microsoft.com/office/word/2018/wordml/cex" xmlns:w16cid="http://schemas.microsoft.com/office/word/2016/wordml/cid" xmlns:w16="http://schemas.microsoft.com/office/word/2018/wordml" xmlns:w16sdtdh="http://schemas.microsoft.com/office/word/2020/wordml/sdtdatahash" xmlns:w16se="http://schemas.microsoft.com/office/word/2015/wordml/symex" xmlns:wpg="http://schemas.microsoft.com/office/word/2010/wordprocessingGroup" xmlns:wpi="http://schemas.microsoft.com/office/word/2010/wordprocessingInk" xmlns:wne="http://schemas.microsoft.com/office/word/2006/wordml" xmlns:wps="http://schemas.microsoft.com/office/word/2010/wordprocessingShape" mc:Ignorable="w14 w15 w16se w16cid w16 w16cex w16sdtdh wp14">
+<w:document xmlns:wpc="http://schemas.microsoft.com/office/word/2010/wordprocessingCanvas" xmlns:cx="http://schemas.microsoft.com/office/drawing/2014/chartex" xmlns:cx1="http://schemas.microsoft.com/office/drawing/2015/9/8/chartex" xmlns:cx2="http://schemas.microsoft.com/office/drawing/2015/10/21/chartex" xmlns:cx3="http://schemas.microsoft.com/office/drawing/2016/5/9/chartex" xmlns:cx4="http://schemas.microsoft.com/office/drawing/2016/5/10/chartex" xmlns:cx5="http://schemas.microsoft.com/office/drawing/2016/5/11/chartex" xmlns:cx6="http://schemas.microsoft.com/office/drawing/2016/5/12/chartex" xmlns:cx7="http://schemas.microsoft.com/office/drawing/2016/5/13/chartex" xmlns:cx8="http://schemas.microsoft.com/office/drawing/2016/5/14/chartex" xmlns:mc="http://schemas.openxmlformats.org/markup-compatibility/2006" xmlns:aink="http://schemas.microsoft.com/office/drawing/2016/ink" xmlns:am3d="http://schemas.microsoft.com/office/drawing/2017/model3d" xmlns:o="urn:schemas-microsoft-com:office:office" xmlns:r="http://schemas.openxmlformats.org/officeDocument/2006/relationships" xmlns:m="http://schemas.openxmlformats.org/officeDocument/2006/math" xmlns:v="urn:schemas-microsoft-com:vml" xmlns:wp14="http://schemas.microsoft.com/office/word/2010/wordprocessingDrawing" xmlns:wp="http://schemas.openxmlformats.org/drawingml/2006/wordprocessingDrawing" xmlns:w10="urn:schemas-microsoft-com:office:word" xmlns:w="http://schemas.openxmlformats.org/wordprocessingml/2006/main" xmlns:w14="http://schemas.microsoft.com/office/word/2010/wordml" xmlns:w15="http://schemas.microsoft.com/office/word/2012/wordml" xmlns:w16cex="http://schemas.microsoft.com/office/word/2018/wordml/cex" xmlns:w16cid="http://schemas.microsoft.com/office/word/2016/wordml/cid" xmlns:w16="http://schemas.microsoft.com/office/word/2018/wordml" xmlns:w16sdtdh="http://schemas.microsoft.com/office/word/2020/wordml/sdtdatahash" xmlns:w16se="http://schemas.microsoft.com/office/word/2015/wordml/symex" xmlns:wpg="http://schemas.microsoft.com/office/word/2010/wordprocessingGroup" xmlns:wpi="http://schemas.microsoft.com/office/word/2010/wordprocessingInk" xmlns:wne="http://schemas.microsoft.com/office/word/2006/wordml" xmlns:wps="http://schemas.microsoft.com/office/word/2010/wordprocessingShape" mc:Ignorable="w14 w15 w16se w16cid w16 w16cex w16sdtdh wp14">
   <w:body>
     <w:p>
       <w:pPr>
@@ -85,7 +85,7 @@
           <w:sz w:val="24"/>
           <w:szCs w:val="24"/>
         </w:rPr>
-        <w:t>Add to the mind cloud below with the skills that you will require for a career in cyber security</w:t>
+        <w:t>Add to the mind cloud below the skills that you will require for a career in cyber security</w:t>
       </w:r>
       <w:r>
         <w:rPr>
@@ -165,16 +165,16 @@
         <mc:AlternateContent>
           <mc:Choice Requires="wps">
             <w:drawing>
-              <wp:anchor distT="0" distB="0" distL="114300" distR="114300" simplePos="0" relativeHeight="251659264" behindDoc="0" locked="0" layoutInCell="1" allowOverlap="1" wp14:anchorId="5698A3CF" wp14:editId="081E40B6">
+              <wp:anchor distT="0" distB="0" distL="114300" distR="114300" simplePos="0" relativeHeight="251659264" behindDoc="0" locked="0" layoutInCell="1" allowOverlap="1" wp14:anchorId="5698A3CF" wp14:editId="06D34B04">
                 <wp:simplePos x="0" y="0"/>
                 <wp:positionH relativeFrom="margin">
-                  <wp:posOffset>1516380</wp:posOffset>
+                  <wp:posOffset>1056640</wp:posOffset>
                 </wp:positionH>
                 <wp:positionV relativeFrom="paragraph">
-                  <wp:posOffset>147320</wp:posOffset>
+                  <wp:posOffset>10632</wp:posOffset>
                 </wp:positionV>
-                <wp:extent cx="2438400" cy="1653540"/>
-                <wp:effectExtent l="38100" t="0" r="38100" b="403860"/>
+                <wp:extent cx="3942258" cy="2679524"/>
+                <wp:effectExtent l="63500" t="0" r="20320" b="610235"/>
                 <wp:wrapNone/>
                 <wp:docPr id="1" name="Thought Bubble: Cloud 1"/>
                 <wp:cNvGraphicFramePr/>
@@ -185,7 +185,7 @@
                       <wps:spPr>
                         <a:xfrm>
                           <a:off x="0" y="0"/>
-                          <a:ext cx="2438400" cy="1653540"/>
+                          <a:ext cx="3942258" cy="2679524"/>
                         </a:xfrm>
                         <a:prstGeom prst="cloudCallout">
                           <a:avLst>
@@ -291,7 +291,7 @@
                 </v:handles>
                 <o:complex v:ext="view"/>
               </v:shapetype>
-              <v:shape id="Thought Bubble: Cloud 1" o:spid="_x0000_s1026" type="#_x0000_t106" style="position:absolute;margin-left:119.4pt;margin-top:11.6pt;width:192pt;height:130.2pt;z-index:251659264;visibility:visible;mso-wrap-style:square;mso-width-percent:0;mso-height-percent:0;mso-wrap-distance-left:9pt;mso-wrap-distance-top:0;mso-wrap-distance-right:9pt;mso-wrap-distance-bottom:0;mso-position-horizontal:absolute;mso-position-horizontal-relative:margin;mso-position-vertical:absolute;mso-position-vertical-relative:text;mso-width-percent:0;mso-height-percent:0;mso-width-relative:margin;mso-height-relative:margin;v-text-anchor:middle" o:gfxdata="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" adj="83,25771" fillcolor="#00a7e1" strokecolor="#1f3763 [1604]" strokeweight="1pt">
+              <v:shape id="Thought Bubble: Cloud 1" o:spid="_x0000_s1026" type="#_x0000_t106" style="position:absolute;margin-left:83.2pt;margin-top:.85pt;width:310.4pt;height:211pt;z-index:251659264;visibility:visible;mso-wrap-style:square;mso-width-percent:0;mso-height-percent:0;mso-wrap-distance-left:9pt;mso-wrap-distance-top:0;mso-wrap-distance-right:9pt;mso-wrap-distance-bottom:0;mso-position-horizontal:absolute;mso-position-horizontal-relative:margin;mso-position-vertical:absolute;mso-position-vertical-relative:text;mso-width-percent:0;mso-height-percent:0;mso-width-relative:margin;mso-height-relative:margin;v-text-anchor:middle" o:gfxdata="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" adj="83,25771" fillcolor="#00a7e1" strokecolor="#1f3763 [1604]" strokeweight="1pt">
                 <v:stroke joinstyle="miter"/>
                 <v:textbox>
                   <w:txbxContent>
@@ -308,15 +308,6 @@
           </mc:Fallback>
         </mc:AlternateContent>
       </w:r>
-    </w:p>
-    <w:p>
-      <w:pPr>
-        <w:rPr>
-          <w:rFonts w:ascii="Arial" w:hAnsi="Arial" w:cs="Arial"/>
-          <w:sz w:val="24"/>
-          <w:szCs w:val="24"/>
-        </w:rPr>
-      </w:pPr>
       <w:r>
         <w:rPr>
           <w:rFonts w:ascii="Arial" w:hAnsi="Arial" w:cs="Arial"/>
@@ -327,22 +318,22 @@
         <mc:AlternateContent>
           <mc:Choice Requires="wps">
             <w:drawing>
-              <wp:anchor distT="45720" distB="45720" distL="114300" distR="114300" simplePos="0" relativeHeight="251667456" behindDoc="1" locked="0" layoutInCell="1" allowOverlap="1" wp14:anchorId="4691779A" wp14:editId="5FB0E534">
+              <wp:anchor distT="45720" distB="45720" distL="114300" distR="114300" simplePos="0" relativeHeight="251667456" behindDoc="1" locked="0" layoutInCell="1" allowOverlap="1" wp14:anchorId="4691779A" wp14:editId="13B06AA7">
                 <wp:simplePos x="0" y="0"/>
                 <wp:positionH relativeFrom="margin">
-                  <wp:align>right</wp:align>
+                  <wp:posOffset>3084377</wp:posOffset>
                 </wp:positionH>
                 <wp:positionV relativeFrom="paragraph">
-                  <wp:posOffset>9525</wp:posOffset>
+                  <wp:posOffset>235585</wp:posOffset>
                 </wp:positionV>
-                <wp:extent cx="2171700" cy="312420"/>
-                <wp:effectExtent l="0" t="0" r="19050" b="11430"/>
+                <wp:extent cx="2388870" cy="377825"/>
+                <wp:effectExtent l="0" t="0" r="11430" b="15875"/>
                 <wp:wrapTight wrapText="bothSides">
                   <wp:wrapPolygon edited="0">
                     <wp:start x="0" y="0"/>
-                    <wp:lineTo x="0" y="21073"/>
-                    <wp:lineTo x="21600" y="21073"/>
-                    <wp:lineTo x="21600" y="0"/>
+                    <wp:lineTo x="0" y="21782"/>
+                    <wp:lineTo x="21589" y="21782"/>
+                    <wp:lineTo x="21589" y="0"/>
                     <wp:lineTo x="0" y="0"/>
                   </wp:wrapPolygon>
                 </wp:wrapTight>
@@ -359,7 +350,7 @@
                       <wps:spPr bwMode="auto">
                         <a:xfrm>
                           <a:off x="0" y="0"/>
-                          <a:ext cx="2171700" cy="312420"/>
+                          <a:ext cx="2388870" cy="377825"/>
                         </a:xfrm>
                         <a:prstGeom prst="rect">
                           <a:avLst/>
@@ -378,11 +369,7 @@
                       </wps:spPr>
                       <wps:txbx>
                         <w:txbxContent>
-                          <w:p>
-                            <w:r>
-                              <w:t>Skill 4:</w:t>
-                            </w:r>
-                          </w:p>
+                          <w:p/>
                         </w:txbxContent>
                       </wps:txbx>
                       <wps:bodyPr rot="0" vert="horz" wrap="square" lIns="91440" tIns="45720" rIns="91440" bIns="45720" anchor="t" anchorCtr="0">
@@ -406,14 +393,10 @@
                 <v:stroke joinstyle="miter"/>
                 <v:path gradientshapeok="t" o:connecttype="rect"/>
               </v:shapetype>
-              <v:shape id="Text Box 2" o:spid="_x0000_s1027" type="#_x0000_t202" style="position:absolute;margin-left:119.8pt;margin-top:.75pt;width:171pt;height:24.6pt;z-index:-251649024;visibility:visible;mso-wrap-style:square;mso-width-percent:0;mso-height-percent:0;mso-wrap-distance-left:9pt;mso-wrap-distance-top:3.6pt;mso-wrap-distance-right:9pt;mso-wrap-distance-bottom:3.6pt;mso-position-horizontal:right;mso-position-horizontal-relative:margin;mso-position-vertical:absolute;mso-position-vertical-relative:text;mso-width-percent:0;mso-height-percent:0;mso-width-relative:margin;mso-height-relative:margin;v-text-anchor:top" o:gfxdata="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">
+              <v:shape id="Text Box 2" o:spid="_x0000_s1027" type="#_x0000_t202" style="position:absolute;margin-left:242.85pt;margin-top:18.55pt;width:188.1pt;height:29.75pt;z-index:-251649024;visibility:visible;mso-wrap-style:square;mso-width-percent:0;mso-height-percent:0;mso-wrap-distance-left:9pt;mso-wrap-distance-top:3.6pt;mso-wrap-distance-right:9pt;mso-wrap-distance-bottom:3.6pt;mso-position-horizontal:absolute;mso-position-horizontal-relative:margin;mso-position-vertical:absolute;mso-position-vertical-relative:text;mso-width-percent:0;mso-height-percent:0;mso-width-relative:margin;mso-height-relative:margin;v-text-anchor:top" o:gfxdata="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">
                 <v:textbox>
                   <w:txbxContent>
-                    <w:p>
-                      <w:r>
-                        <w:t>Skill 4:</w:t>
-                      </w:r>
-                    </w:p>
+                    <w:p/>
                   </w:txbxContent>
                 </v:textbox>
                 <w10:wrap type="tight" anchorx="margin"/>
@@ -422,6 +405,15 @@
           </mc:Fallback>
         </mc:AlternateContent>
       </w:r>
+    </w:p>
+    <w:p>
+      <w:pPr>
+        <w:rPr>
+          <w:rFonts w:ascii="Arial" w:hAnsi="Arial" w:cs="Arial"/>
+          <w:sz w:val="24"/>
+          <w:szCs w:val="24"/>
+        </w:rPr>
+      </w:pPr>
       <w:r>
         <w:rPr>
           <w:rFonts w:ascii="Arial" w:hAnsi="Arial" w:cs="Arial"/>
@@ -432,16 +424,16 @@
         <mc:AlternateContent>
           <mc:Choice Requires="wps">
             <w:drawing>
-              <wp:anchor distT="45720" distB="45720" distL="114300" distR="114300" simplePos="0" relativeHeight="251661312" behindDoc="0" locked="0" layoutInCell="1" allowOverlap="1" wp14:anchorId="6AB57588" wp14:editId="1C7A8C45">
+              <wp:anchor distT="45720" distB="45720" distL="114300" distR="114300" simplePos="0" relativeHeight="251661312" behindDoc="0" locked="0" layoutInCell="1" allowOverlap="1" wp14:anchorId="6AB57588" wp14:editId="4ECF4E64">
                 <wp:simplePos x="0" y="0"/>
                 <wp:positionH relativeFrom="margin">
-                  <wp:align>left</wp:align>
+                  <wp:posOffset>121285</wp:posOffset>
                 </wp:positionH>
                 <wp:positionV relativeFrom="paragraph">
-                  <wp:posOffset>12700</wp:posOffset>
+                  <wp:posOffset>138902</wp:posOffset>
                 </wp:positionV>
-                <wp:extent cx="1828800" cy="266700"/>
-                <wp:effectExtent l="0" t="0" r="19050" b="19050"/>
+                <wp:extent cx="2479675" cy="398145"/>
+                <wp:effectExtent l="0" t="0" r="9525" b="8255"/>
                 <wp:wrapSquare wrapText="bothSides"/>
                 <wp:docPr id="217" name="Text Box 2"/>
                 <wp:cNvGraphicFramePr>
@@ -456,7 +448,7 @@
                       <wps:spPr bwMode="auto">
                         <a:xfrm>
                           <a:off x="0" y="0"/>
-                          <a:ext cx="1828800" cy="266700"/>
+                          <a:ext cx="2479675" cy="398145"/>
                         </a:xfrm>
                         <a:prstGeom prst="rect">
                           <a:avLst/>
@@ -477,7 +469,7 @@
                         <w:txbxContent>
                           <w:p>
                             <w:r>
-                              <w:t xml:space="preserve">Skill 1: </w:t>
+                              <w:t xml:space="preserve"> </w:t>
                             </w:r>
                           </w:p>
                           <w:p/>
@@ -500,12 +492,12 @@
           </mc:Choice>
           <mc:Fallback>
             <w:pict>
-              <v:shape w14:anchorId="6AB57588" id="_x0000_s1028" type="#_x0000_t202" style="position:absolute;margin-left:0;margin-top:1pt;width:2in;height:21pt;z-index:251661312;visibility:visible;mso-wrap-style:square;mso-width-percent:0;mso-height-percent:0;mso-wrap-distance-left:9pt;mso-wrap-distance-top:3.6pt;mso-wrap-distance-right:9pt;mso-wrap-distance-bottom:3.6pt;mso-position-horizontal:left;mso-position-horizontal-relative:margin;mso-position-vertical:absolute;mso-position-vertical-relative:text;mso-width-percent:0;mso-height-percent:0;mso-width-relative:margin;mso-height-relative:margin;v-text-anchor:top" o:gfxdata="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">
+              <v:shape w14:anchorId="6AB57588" id="_x0000_s1028" type="#_x0000_t202" style="position:absolute;margin-left:9.55pt;margin-top:10.95pt;width:195.25pt;height:31.35pt;z-index:251661312;visibility:visible;mso-wrap-style:square;mso-width-percent:0;mso-height-percent:0;mso-wrap-distance-left:9pt;mso-wrap-distance-top:3.6pt;mso-wrap-distance-right:9pt;mso-wrap-distance-bottom:3.6pt;mso-position-horizontal:absolute;mso-position-horizontal-relative:margin;mso-position-vertical:absolute;mso-position-vertical-relative:text;mso-width-percent:0;mso-height-percent:0;mso-width-relative:margin;mso-height-relative:margin;v-text-anchor:top" o:gfxdata="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">
                 <v:textbox>
                   <w:txbxContent>
                     <w:p>
                       <w:r>
-                        <w:t xml:space="preserve">Skill 1: </w:t>
+                        <w:t xml:space="preserve"> </w:t>
                       </w:r>
                     </w:p>
                     <w:p/>
@@ -545,16 +537,101 @@
         <mc:AlternateContent>
           <mc:Choice Requires="wps">
             <w:drawing>
-              <wp:anchor distT="45720" distB="45720" distL="114300" distR="114300" simplePos="0" relativeHeight="251669504" behindDoc="0" locked="0" layoutInCell="1" allowOverlap="1" wp14:anchorId="7B85144B" wp14:editId="663A429A">
+              <wp:anchor distT="45720" distB="45720" distL="114300" distR="114300" simplePos="0" relativeHeight="251663360" behindDoc="0" locked="0" layoutInCell="1" allowOverlap="1" wp14:anchorId="4FBA3ADC" wp14:editId="7948DDC1">
                 <wp:simplePos x="0" y="0"/>
                 <wp:positionH relativeFrom="margin">
-                  <wp:posOffset>3548380</wp:posOffset>
+                  <wp:posOffset>-335280</wp:posOffset>
                 </wp:positionH>
                 <wp:positionV relativeFrom="paragraph">
-                  <wp:posOffset>83185</wp:posOffset>
+                  <wp:posOffset>221452</wp:posOffset>
                 </wp:positionV>
-                <wp:extent cx="2171700" cy="304800"/>
-                <wp:effectExtent l="0" t="0" r="19050" b="19050"/>
+                <wp:extent cx="2475230" cy="403225"/>
+                <wp:effectExtent l="0" t="0" r="13970" b="15875"/>
+                <wp:wrapSquare wrapText="bothSides"/>
+                <wp:docPr id="3" name="Text Box 2"/>
+                <wp:cNvGraphicFramePr>
+                  <a:graphicFrameLocks xmlns:a="http://schemas.openxmlformats.org/drawingml/2006/main"/>
+                </wp:cNvGraphicFramePr>
+                <a:graphic xmlns:a="http://schemas.openxmlformats.org/drawingml/2006/main">
+                  <a:graphicData uri="http://schemas.microsoft.com/office/word/2010/wordprocessingShape">
+                    <wps:wsp>
+                      <wps:cNvSpPr txBox="1">
+                        <a:spLocks noChangeArrowheads="1"/>
+                      </wps:cNvSpPr>
+                      <wps:spPr bwMode="auto">
+                        <a:xfrm>
+                          <a:off x="0" y="0"/>
+                          <a:ext cx="2475230" cy="403225"/>
+                        </a:xfrm>
+                        <a:prstGeom prst="rect">
+                          <a:avLst/>
+                        </a:prstGeom>
+                        <a:solidFill>
+                          <a:srgbClr val="FFFFFF"/>
+                        </a:solidFill>
+                        <a:ln w="9525">
+                          <a:solidFill>
+                            <a:srgbClr val="000000"/>
+                          </a:solidFill>
+                          <a:miter lim="800000"/>
+                          <a:headEnd/>
+                          <a:tailEnd/>
+                        </a:ln>
+                      </wps:spPr>
+                      <wps:txbx>
+                        <w:txbxContent>
+                          <w:p/>
+                        </w:txbxContent>
+                      </wps:txbx>
+                      <wps:bodyPr rot="0" vert="horz" wrap="square" lIns="91440" tIns="45720" rIns="91440" bIns="45720" anchor="t" anchorCtr="0">
+                        <a:noAutofit/>
+                      </wps:bodyPr>
+                    </wps:wsp>
+                  </a:graphicData>
+                </a:graphic>
+                <wp14:sizeRelH relativeFrom="margin">
+                  <wp14:pctWidth>0</wp14:pctWidth>
+                </wp14:sizeRelH>
+                <wp14:sizeRelV relativeFrom="margin">
+                  <wp14:pctHeight>0</wp14:pctHeight>
+                </wp14:sizeRelV>
+              </wp:anchor>
+            </w:drawing>
+          </mc:Choice>
+          <mc:Fallback>
+            <w:pict>
+              <v:shape w14:anchorId="4FBA3ADC" id="_x0000_s1029" type="#_x0000_t202" style="position:absolute;margin-left:-26.4pt;margin-top:17.45pt;width:194.9pt;height:31.75pt;z-index:251663360;visibility:visible;mso-wrap-style:square;mso-width-percent:0;mso-height-percent:0;mso-wrap-distance-left:9pt;mso-wrap-distance-top:3.6pt;mso-wrap-distance-right:9pt;mso-wrap-distance-bottom:3.6pt;mso-position-horizontal:absolute;mso-position-horizontal-relative:margin;mso-position-vertical:absolute;mso-position-vertical-relative:text;mso-width-percent:0;mso-height-percent:0;mso-width-relative:margin;mso-height-relative:margin;v-text-anchor:top" o:gfxdata="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">
+                <v:textbox>
+                  <w:txbxContent>
+                    <w:p/>
+                  </w:txbxContent>
+                </v:textbox>
+                <w10:wrap type="square" anchorx="margin"/>
+              </v:shape>
+            </w:pict>
+          </mc:Fallback>
+        </mc:AlternateContent>
+      </w:r>
+      <w:r>
+        <w:rPr>
+          <w:rFonts w:ascii="Arial" w:hAnsi="Arial" w:cs="Arial"/>
+          <w:noProof/>
+          <w:sz w:val="24"/>
+          <w:szCs w:val="24"/>
+        </w:rPr>
+        <mc:AlternateContent>
+          <mc:Choice Requires="wps">
+            <w:drawing>
+              <wp:anchor distT="45720" distB="45720" distL="114300" distR="114300" simplePos="0" relativeHeight="251669504" behindDoc="0" locked="0" layoutInCell="1" allowOverlap="1" wp14:anchorId="7B85144B" wp14:editId="6A6D4CF8">
+                <wp:simplePos x="0" y="0"/>
+                <wp:positionH relativeFrom="margin">
+                  <wp:posOffset>3716655</wp:posOffset>
+                </wp:positionH>
+                <wp:positionV relativeFrom="paragraph">
+                  <wp:posOffset>56352</wp:posOffset>
+                </wp:positionV>
+                <wp:extent cx="2625090" cy="422910"/>
+                <wp:effectExtent l="0" t="0" r="16510" b="8890"/>
                 <wp:wrapSquare wrapText="bothSides"/>
                 <wp:docPr id="8" name="Text Box 2"/>
                 <wp:cNvGraphicFramePr>
@@ -569,7 +646,298 @@
                       <wps:spPr bwMode="auto">
                         <a:xfrm>
                           <a:off x="0" y="0"/>
-                          <a:ext cx="2171700" cy="304800"/>
+                          <a:ext cx="2625090" cy="422910"/>
+                        </a:xfrm>
+                        <a:prstGeom prst="rect">
+                          <a:avLst/>
+                        </a:prstGeom>
+                        <a:solidFill>
+                          <a:srgbClr val="FFFFFF"/>
+                        </a:solidFill>
+                        <a:ln w="9525">
+                          <a:solidFill>
+                            <a:srgbClr val="000000"/>
+                          </a:solidFill>
+                          <a:miter lim="800000"/>
+                          <a:headEnd/>
+                          <a:tailEnd/>
+                        </a:ln>
+                      </wps:spPr>
+                      <wps:txbx>
+                        <w:txbxContent>
+                          <w:p/>
+                        </w:txbxContent>
+                      </wps:txbx>
+                      <wps:bodyPr rot="0" vert="horz" wrap="square" lIns="91440" tIns="45720" rIns="91440" bIns="45720" anchor="t" anchorCtr="0">
+                        <a:noAutofit/>
+                      </wps:bodyPr>
+                    </wps:wsp>
+                  </a:graphicData>
+                </a:graphic>
+                <wp14:sizeRelH relativeFrom="margin">
+                  <wp14:pctWidth>0</wp14:pctWidth>
+                </wp14:sizeRelH>
+                <wp14:sizeRelV relativeFrom="margin">
+                  <wp14:pctHeight>0</wp14:pctHeight>
+                </wp14:sizeRelV>
+              </wp:anchor>
+            </w:drawing>
+          </mc:Choice>
+          <mc:Fallback>
+            <w:pict>
+              <v:shape w14:anchorId="7B85144B" id="_x0000_s1030" type="#_x0000_t202" style="position:absolute;margin-left:292.65pt;margin-top:4.45pt;width:206.7pt;height:33.3pt;z-index:251669504;visibility:visible;mso-wrap-style:square;mso-width-percent:0;mso-height-percent:0;mso-wrap-distance-left:9pt;mso-wrap-distance-top:3.6pt;mso-wrap-distance-right:9pt;mso-wrap-distance-bottom:3.6pt;mso-position-horizontal:absolute;mso-position-horizontal-relative:margin;mso-position-vertical:absolute;mso-position-vertical-relative:text;mso-width-percent:0;mso-height-percent:0;mso-width-relative:margin;mso-height-relative:margin;v-text-anchor:top" o:gfxdata="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">
+                <v:textbox>
+                  <w:txbxContent>
+                    <w:p/>
+                  </w:txbxContent>
+                </v:textbox>
+                <w10:wrap type="square" anchorx="margin"/>
+              </v:shape>
+            </w:pict>
+          </mc:Fallback>
+        </mc:AlternateContent>
+      </w:r>
+    </w:p>
+    <w:p>
+      <w:pPr>
+        <w:rPr>
+          <w:rFonts w:ascii="Arial" w:hAnsi="Arial" w:cs="Arial"/>
+          <w:sz w:val="24"/>
+          <w:szCs w:val="24"/>
+        </w:rPr>
+      </w:pPr>
+    </w:p>
+    <w:p>
+      <w:pPr>
+        <w:rPr>
+          <w:rFonts w:ascii="Arial" w:hAnsi="Arial" w:cs="Arial"/>
+          <w:sz w:val="24"/>
+          <w:szCs w:val="24"/>
+        </w:rPr>
+      </w:pPr>
+      <w:r>
+        <w:rPr>
+          <w:rFonts w:ascii="Arial" w:hAnsi="Arial" w:cs="Arial"/>
+          <w:noProof/>
+          <w:sz w:val="24"/>
+          <w:szCs w:val="24"/>
+        </w:rPr>
+        <mc:AlternateContent>
+          <mc:Choice Requires="wps">
+            <w:drawing>
+              <wp:anchor distT="45720" distB="45720" distL="114300" distR="114300" simplePos="0" relativeHeight="251673600" behindDoc="0" locked="0" layoutInCell="1" allowOverlap="1" wp14:anchorId="3A74BE96" wp14:editId="7D3C0A5F">
+                <wp:simplePos x="0" y="0"/>
+                <wp:positionH relativeFrom="margin">
+                  <wp:posOffset>2806065</wp:posOffset>
+                </wp:positionH>
+                <wp:positionV relativeFrom="paragraph">
+                  <wp:posOffset>177800</wp:posOffset>
+                </wp:positionV>
+                <wp:extent cx="2480310" cy="382270"/>
+                <wp:effectExtent l="0" t="0" r="8890" b="11430"/>
+                <wp:wrapSquare wrapText="bothSides"/>
+                <wp:docPr id="6" name="Text Box 2"/>
+                <wp:cNvGraphicFramePr>
+                  <a:graphicFrameLocks xmlns:a="http://schemas.openxmlformats.org/drawingml/2006/main"/>
+                </wp:cNvGraphicFramePr>
+                <a:graphic xmlns:a="http://schemas.openxmlformats.org/drawingml/2006/main">
+                  <a:graphicData uri="http://schemas.microsoft.com/office/word/2010/wordprocessingShape">
+                    <wps:wsp>
+                      <wps:cNvSpPr txBox="1">
+                        <a:spLocks noChangeArrowheads="1"/>
+                      </wps:cNvSpPr>
+                      <wps:spPr bwMode="auto">
+                        <a:xfrm>
+                          <a:off x="0" y="0"/>
+                          <a:ext cx="2480310" cy="382270"/>
+                        </a:xfrm>
+                        <a:prstGeom prst="rect">
+                          <a:avLst/>
+                        </a:prstGeom>
+                        <a:solidFill>
+                          <a:srgbClr val="FFFFFF"/>
+                        </a:solidFill>
+                        <a:ln w="9525">
+                          <a:solidFill>
+                            <a:srgbClr val="000000"/>
+                          </a:solidFill>
+                          <a:miter lim="800000"/>
+                          <a:headEnd/>
+                          <a:tailEnd/>
+                        </a:ln>
+                      </wps:spPr>
+                      <wps:txbx>
+                        <w:txbxContent>
+                          <w:p/>
+                        </w:txbxContent>
+                      </wps:txbx>
+                      <wps:bodyPr rot="0" vert="horz" wrap="square" lIns="91440" tIns="45720" rIns="91440" bIns="45720" anchor="t" anchorCtr="0">
+                        <a:noAutofit/>
+                      </wps:bodyPr>
+                    </wps:wsp>
+                  </a:graphicData>
+                </a:graphic>
+                <wp14:sizeRelH relativeFrom="margin">
+                  <wp14:pctWidth>0</wp14:pctWidth>
+                </wp14:sizeRelH>
+                <wp14:sizeRelV relativeFrom="margin">
+                  <wp14:pctHeight>0</wp14:pctHeight>
+                </wp14:sizeRelV>
+              </wp:anchor>
+            </w:drawing>
+          </mc:Choice>
+          <mc:Fallback>
+            <w:pict>
+              <v:shape w14:anchorId="3A74BE96" id="_x0000_s1031" type="#_x0000_t202" style="position:absolute;margin-left:220.95pt;margin-top:14pt;width:195.3pt;height:30.1pt;z-index:251673600;visibility:visible;mso-wrap-style:square;mso-width-percent:0;mso-height-percent:0;mso-wrap-distance-left:9pt;mso-wrap-distance-top:3.6pt;mso-wrap-distance-right:9pt;mso-wrap-distance-bottom:3.6pt;mso-position-horizontal:absolute;mso-position-horizontal-relative:margin;mso-position-vertical:absolute;mso-position-vertical-relative:text;mso-width-percent:0;mso-height-percent:0;mso-width-relative:margin;mso-height-relative:margin;v-text-anchor:top" o:gfxdata="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">
+                <v:textbox>
+                  <w:txbxContent>
+                    <w:p/>
+                  </w:txbxContent>
+                </v:textbox>
+                <w10:wrap type="square" anchorx="margin"/>
+              </v:shape>
+            </w:pict>
+          </mc:Fallback>
+        </mc:AlternateContent>
+      </w:r>
+    </w:p>
+    <w:p>
+      <w:pPr>
+        <w:rPr>
+          <w:rFonts w:ascii="Arial" w:hAnsi="Arial" w:cs="Arial"/>
+          <w:sz w:val="24"/>
+          <w:szCs w:val="24"/>
+        </w:rPr>
+      </w:pPr>
+      <w:r>
+        <w:rPr>
+          <w:rFonts w:ascii="Arial" w:hAnsi="Arial" w:cs="Arial"/>
+          <w:noProof/>
+          <w:sz w:val="24"/>
+          <w:szCs w:val="24"/>
+        </w:rPr>
+        <mc:AlternateContent>
+          <mc:Choice Requires="wps">
+            <w:drawing>
+              <wp:anchor distT="45720" distB="45720" distL="114300" distR="114300" simplePos="0" relativeHeight="251665408" behindDoc="0" locked="0" layoutInCell="1" allowOverlap="1" wp14:anchorId="298843EE" wp14:editId="28E139E5">
+                <wp:simplePos x="0" y="0"/>
+                <wp:positionH relativeFrom="margin">
+                  <wp:posOffset>-630574</wp:posOffset>
+                </wp:positionH>
+                <wp:positionV relativeFrom="paragraph">
+                  <wp:posOffset>142875</wp:posOffset>
+                </wp:positionV>
+                <wp:extent cx="2475484" cy="374015"/>
+                <wp:effectExtent l="0" t="0" r="13970" b="6985"/>
+                <wp:wrapSquare wrapText="bothSides"/>
+                <wp:docPr id="4" name="Text Box 2"/>
+                <wp:cNvGraphicFramePr>
+                  <a:graphicFrameLocks xmlns:a="http://schemas.openxmlformats.org/drawingml/2006/main"/>
+                </wp:cNvGraphicFramePr>
+                <a:graphic xmlns:a="http://schemas.openxmlformats.org/drawingml/2006/main">
+                  <a:graphicData uri="http://schemas.microsoft.com/office/word/2010/wordprocessingShape">
+                    <wps:wsp>
+                      <wps:cNvSpPr txBox="1">
+                        <a:spLocks noChangeArrowheads="1"/>
+                      </wps:cNvSpPr>
+                      <wps:spPr bwMode="auto">
+                        <a:xfrm>
+                          <a:off x="0" y="0"/>
+                          <a:ext cx="2475484" cy="374015"/>
+                        </a:xfrm>
+                        <a:prstGeom prst="rect">
+                          <a:avLst/>
+                        </a:prstGeom>
+                        <a:solidFill>
+                          <a:srgbClr val="FFFFFF"/>
+                        </a:solidFill>
+                        <a:ln w="9525">
+                          <a:solidFill>
+                            <a:srgbClr val="000000"/>
+                          </a:solidFill>
+                          <a:miter lim="800000"/>
+                          <a:headEnd/>
+                          <a:tailEnd/>
+                        </a:ln>
+                      </wps:spPr>
+                      <wps:txbx>
+                        <w:txbxContent>
+                          <w:p/>
+                        </w:txbxContent>
+                      </wps:txbx>
+                      <wps:bodyPr rot="0" vert="horz" wrap="square" lIns="91440" tIns="45720" rIns="91440" bIns="45720" anchor="t" anchorCtr="0">
+                        <a:noAutofit/>
+                      </wps:bodyPr>
+                    </wps:wsp>
+                  </a:graphicData>
+                </a:graphic>
+                <wp14:sizeRelH relativeFrom="margin">
+                  <wp14:pctWidth>0</wp14:pctWidth>
+                </wp14:sizeRelH>
+                <wp14:sizeRelV relativeFrom="margin">
+                  <wp14:pctHeight>0</wp14:pctHeight>
+                </wp14:sizeRelV>
+              </wp:anchor>
+            </w:drawing>
+          </mc:Choice>
+          <mc:Fallback>
+            <w:pict>
+              <v:shape w14:anchorId="298843EE" id="_x0000_s1032" type="#_x0000_t202" style="position:absolute;margin-left:-49.65pt;margin-top:11.25pt;width:194.9pt;height:29.45pt;z-index:251665408;visibility:visible;mso-wrap-style:square;mso-width-percent:0;mso-height-percent:0;mso-wrap-distance-left:9pt;mso-wrap-distance-top:3.6pt;mso-wrap-distance-right:9pt;mso-wrap-distance-bottom:3.6pt;mso-position-horizontal:absolute;mso-position-horizontal-relative:margin;mso-position-vertical:absolute;mso-position-vertical-relative:text;mso-width-percent:0;mso-height-percent:0;mso-width-relative:margin;mso-height-relative:margin;v-text-anchor:top" o:gfxdata="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">
+                <v:textbox>
+                  <w:txbxContent>
+                    <w:p/>
+                  </w:txbxContent>
+                </v:textbox>
+                <w10:wrap type="square" anchorx="margin"/>
+              </v:shape>
+            </w:pict>
+          </mc:Fallback>
+        </mc:AlternateContent>
+      </w:r>
+    </w:p>
+    <w:p>
+      <w:pPr>
+        <w:rPr>
+          <w:rFonts w:ascii="Arial" w:hAnsi="Arial" w:cs="Arial"/>
+          <w:sz w:val="24"/>
+          <w:szCs w:val="24"/>
+        </w:rPr>
+      </w:pPr>
+      <w:r>
+        <w:rPr>
+          <w:rFonts w:ascii="Arial" w:hAnsi="Arial" w:cs="Arial"/>
+          <w:noProof/>
+          <w:sz w:val="24"/>
+          <w:szCs w:val="24"/>
+        </w:rPr>
+        <mc:AlternateContent>
+          <mc:Choice Requires="wps">
+            <w:drawing>
+              <wp:anchor distT="45720" distB="45720" distL="114300" distR="114300" simplePos="0" relativeHeight="251671552" behindDoc="0" locked="0" layoutInCell="1" allowOverlap="1" wp14:anchorId="4C94BDF9" wp14:editId="4CF5E162">
+                <wp:simplePos x="0" y="0"/>
+                <wp:positionH relativeFrom="margin">
+                  <wp:posOffset>3711575</wp:posOffset>
+                </wp:positionH>
+                <wp:positionV relativeFrom="paragraph">
+                  <wp:posOffset>251638</wp:posOffset>
+                </wp:positionV>
+                <wp:extent cx="2407920" cy="387248"/>
+                <wp:effectExtent l="0" t="0" r="17780" b="6985"/>
+                <wp:wrapSquare wrapText="bothSides"/>
+                <wp:docPr id="2" name="Text Box 2"/>
+                <wp:cNvGraphicFramePr>
+                  <a:graphicFrameLocks xmlns:a="http://schemas.openxmlformats.org/drawingml/2006/main"/>
+                </wp:cNvGraphicFramePr>
+                <a:graphic xmlns:a="http://schemas.openxmlformats.org/drawingml/2006/main">
+                  <a:graphicData uri="http://schemas.microsoft.com/office/word/2010/wordprocessingShape">
+                    <wps:wsp>
+                      <wps:cNvSpPr txBox="1">
+                        <a:spLocks noChangeArrowheads="1"/>
+                      </wps:cNvSpPr>
+                      <wps:spPr bwMode="auto">
+                        <a:xfrm>
+                          <a:off x="0" y="0"/>
+                          <a:ext cx="2407920" cy="387248"/>
                         </a:xfrm>
                         <a:prstGeom prst="rect">
                           <a:avLst/>
@@ -590,9 +958,10 @@
                         <w:txbxContent>
                           <w:p>
                             <w:r>
-                              <w:t>Skill 5:</w:t>
+                              <w:t xml:space="preserve"> </w:t>
                             </w:r>
                           </w:p>
+                          <w:p/>
                         </w:txbxContent>
                       </wps:txbx>
                       <wps:bodyPr rot="0" vert="horz" wrap="square" lIns="91440" tIns="45720" rIns="91440" bIns="45720" anchor="t" anchorCtr="0">
@@ -612,14 +981,15 @@
           </mc:Choice>
           <mc:Fallback>
             <w:pict>
-              <v:shape w14:anchorId="7B85144B" id="_x0000_s1029" type="#_x0000_t202" style="position:absolute;margin-left:279.4pt;margin-top:6.55pt;width:171pt;height:24pt;z-index:251669504;visibility:visible;mso-wrap-style:square;mso-width-percent:0;mso-height-percent:0;mso-wrap-distance-left:9pt;mso-wrap-distance-top:3.6pt;mso-wrap-distance-right:9pt;mso-wrap-distance-bottom:3.6pt;mso-position-horizontal:absolute;mso-position-horizontal-relative:margin;mso-position-vertical:absolute;mso-position-vertical-relative:text;mso-width-percent:0;mso-height-percent:0;mso-width-relative:margin;mso-height-relative:margin;v-text-anchor:top" o:gfxdata="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">
+              <v:shape w14:anchorId="4C94BDF9" id="_x0000_s1033" type="#_x0000_t202" style="position:absolute;margin-left:292.25pt;margin-top:19.8pt;width:189.6pt;height:30.5pt;z-index:251671552;visibility:visible;mso-wrap-style:square;mso-width-percent:0;mso-height-percent:0;mso-wrap-distance-left:9pt;mso-wrap-distance-top:3.6pt;mso-wrap-distance-right:9pt;mso-wrap-distance-bottom:3.6pt;mso-position-horizontal:absolute;mso-position-horizontal-relative:margin;mso-position-vertical:absolute;mso-position-vertical-relative:text;mso-width-percent:0;mso-height-percent:0;mso-width-relative:margin;mso-height-relative:margin;v-text-anchor:top" o:gfxdata="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">
                 <v:textbox>
                   <w:txbxContent>
                     <w:p>
                       <w:r>
-                        <w:t>Skill 5:</w:t>
+                        <w:t xml:space="preserve"> </w:t>
                       </w:r>
                     </w:p>
+                    <w:p/>
                   </w:txbxContent>
                 </v:textbox>
                 <w10:wrap type="square" anchorx="margin"/>
@@ -628,6 +998,25 @@
           </mc:Fallback>
         </mc:AlternateContent>
       </w:r>
+    </w:p>
+    <w:p>
+      <w:pPr>
+        <w:jc w:val="center"/>
+        <w:rPr>
+          <w:rFonts w:ascii="Arial" w:hAnsi="Arial" w:cs="Arial"/>
+          <w:sz w:val="24"/>
+          <w:szCs w:val="24"/>
+        </w:rPr>
+      </w:pPr>
+    </w:p>
+    <w:p>
+      <w:pPr>
+        <w:rPr>
+          <w:rFonts w:ascii="Arial" w:hAnsi="Arial" w:cs="Arial"/>
+          <w:sz w:val="24"/>
+          <w:szCs w:val="24"/>
+        </w:rPr>
+      </w:pPr>
       <w:r>
         <w:rPr>
           <w:rFonts w:ascii="Arial" w:hAnsi="Arial" w:cs="Arial"/>
@@ -638,18 +1027,18 @@
         <mc:AlternateContent>
           <mc:Choice Requires="wps">
             <w:drawing>
-              <wp:anchor distT="45720" distB="45720" distL="114300" distR="114300" simplePos="0" relativeHeight="251663360" behindDoc="0" locked="0" layoutInCell="1" allowOverlap="1" wp14:anchorId="4FBA3ADC" wp14:editId="20E113F4">
+              <wp:anchor distT="45720" distB="45720" distL="114300" distR="114300" simplePos="0" relativeHeight="251675648" behindDoc="0" locked="0" layoutInCell="1" allowOverlap="1" wp14:anchorId="3E82C2D3" wp14:editId="12EE7EBA">
                 <wp:simplePos x="0" y="0"/>
                 <wp:positionH relativeFrom="margin">
-                  <wp:align>left</wp:align>
+                  <wp:posOffset>334343</wp:posOffset>
                 </wp:positionH>
                 <wp:positionV relativeFrom="paragraph">
-                  <wp:posOffset>83185</wp:posOffset>
+                  <wp:posOffset>49574</wp:posOffset>
                 </wp:positionV>
-                <wp:extent cx="1836420" cy="297180"/>
-                <wp:effectExtent l="0" t="0" r="11430" b="26670"/>
+                <wp:extent cx="2475865" cy="374015"/>
+                <wp:effectExtent l="0" t="0" r="13335" b="6985"/>
                 <wp:wrapSquare wrapText="bothSides"/>
-                <wp:docPr id="3" name="Text Box 2"/>
+                <wp:docPr id="9" name="Text Box 2"/>
                 <wp:cNvGraphicFramePr>
                   <a:graphicFrameLocks xmlns:a="http://schemas.openxmlformats.org/drawingml/2006/main"/>
                 </wp:cNvGraphicFramePr>
@@ -662,7 +1051,7 @@
                       <wps:spPr bwMode="auto">
                         <a:xfrm>
                           <a:off x="0" y="0"/>
-                          <a:ext cx="1836420" cy="297180"/>
+                          <a:ext cx="2475865" cy="374015"/>
                         </a:xfrm>
                         <a:prstGeom prst="rect">
                           <a:avLst/>
@@ -681,11 +1070,7 @@
                       </wps:spPr>
                       <wps:txbx>
                         <w:txbxContent>
-                          <w:p>
-                            <w:r>
-                              <w:t>Skill 2:</w:t>
-                            </w:r>
-                          </w:p>
+                          <w:p/>
                         </w:txbxContent>
                       </wps:txbx>
                       <wps:bodyPr rot="0" vert="horz" wrap="square" lIns="91440" tIns="45720" rIns="91440" bIns="45720" anchor="t" anchorCtr="0">
@@ -705,14 +1090,10 @@
           </mc:Choice>
           <mc:Fallback>
             <w:pict>
-              <v:shape w14:anchorId="4FBA3ADC" id="_x0000_s1030" type="#_x0000_t202" style="position:absolute;margin-left:0;margin-top:6.55pt;width:144.6pt;height:23.4pt;z-index:251663360;visibility:visible;mso-wrap-style:square;mso-width-percent:0;mso-height-percent:0;mso-wrap-distance-left:9pt;mso-wrap-distance-top:3.6pt;mso-wrap-distance-right:9pt;mso-wrap-distance-bottom:3.6pt;mso-position-horizontal:left;mso-position-horizontal-relative:margin;mso-position-vertical:absolute;mso-position-vertical-relative:text;mso-width-percent:0;mso-height-percent:0;mso-width-relative:margin;mso-height-relative:margin;v-text-anchor:top" o:gfxdata="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">
+              <v:shape w14:anchorId="3E82C2D3" id="_x0000_s1034" type="#_x0000_t202" style="position:absolute;margin-left:26.35pt;margin-top:3.9pt;width:194.95pt;height:29.45pt;z-index:251675648;visibility:visible;mso-wrap-style:square;mso-width-percent:0;mso-height-percent:0;mso-wrap-distance-left:9pt;mso-wrap-distance-top:3.6pt;mso-wrap-distance-right:9pt;mso-wrap-distance-bottom:3.6pt;mso-position-horizontal:absolute;mso-position-horizontal-relative:margin;mso-position-vertical:absolute;mso-position-vertical-relative:text;mso-width-percent:0;mso-height-percent:0;mso-width-relative:margin;mso-height-relative:margin;v-text-anchor:top" o:gfxdata="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">
                 <v:textbox>
                   <w:txbxContent>
-                    <w:p>
-                      <w:r>
-                        <w:t>Skill 2:</w:t>
-                      </w:r>
-                    </w:p>
+                    <w:p/>
                   </w:txbxContent>
                 </v:textbox>
                 <w10:wrap type="square" anchorx="margin"/>
@@ -733,118 +1114,6 @@
     </w:p>
     <w:p>
       <w:pPr>
-        <w:rPr>
-          <w:rFonts w:ascii="Arial" w:hAnsi="Arial" w:cs="Arial"/>
-          <w:sz w:val="24"/>
-          <w:szCs w:val="24"/>
-        </w:rPr>
-      </w:pPr>
-      <w:r>
-        <w:rPr>
-          <w:rFonts w:ascii="Arial" w:hAnsi="Arial" w:cs="Arial"/>
-          <w:noProof/>
-          <w:sz w:val="24"/>
-          <w:szCs w:val="24"/>
-        </w:rPr>
-        <mc:AlternateContent>
-          <mc:Choice Requires="wps">
-            <w:drawing>
-              <wp:anchor distT="45720" distB="45720" distL="114300" distR="114300" simplePos="0" relativeHeight="251665408" behindDoc="0" locked="0" layoutInCell="1" allowOverlap="1" wp14:anchorId="298843EE" wp14:editId="47408411">
-                <wp:simplePos x="0" y="0"/>
-                <wp:positionH relativeFrom="margin">
-                  <wp:align>left</wp:align>
-                </wp:positionH>
-                <wp:positionV relativeFrom="paragraph">
-                  <wp:posOffset>164465</wp:posOffset>
-                </wp:positionV>
-                <wp:extent cx="1851660" cy="259080"/>
-                <wp:effectExtent l="0" t="0" r="15240" b="26670"/>
-                <wp:wrapSquare wrapText="bothSides"/>
-                <wp:docPr id="4" name="Text Box 2"/>
-                <wp:cNvGraphicFramePr>
-                  <a:graphicFrameLocks xmlns:a="http://schemas.openxmlformats.org/drawingml/2006/main"/>
-                </wp:cNvGraphicFramePr>
-                <a:graphic xmlns:a="http://schemas.openxmlformats.org/drawingml/2006/main">
-                  <a:graphicData uri="http://schemas.microsoft.com/office/word/2010/wordprocessingShape">
-                    <wps:wsp>
-                      <wps:cNvSpPr txBox="1">
-                        <a:spLocks noChangeArrowheads="1"/>
-                      </wps:cNvSpPr>
-                      <wps:spPr bwMode="auto">
-                        <a:xfrm>
-                          <a:off x="0" y="0"/>
-                          <a:ext cx="1851660" cy="259080"/>
-                        </a:xfrm>
-                        <a:prstGeom prst="rect">
-                          <a:avLst/>
-                        </a:prstGeom>
-                        <a:solidFill>
-                          <a:srgbClr val="FFFFFF"/>
-                        </a:solidFill>
-                        <a:ln w="9525">
-                          <a:solidFill>
-                            <a:srgbClr val="000000"/>
-                          </a:solidFill>
-                          <a:miter lim="800000"/>
-                          <a:headEnd/>
-                          <a:tailEnd/>
-                        </a:ln>
-                      </wps:spPr>
-                      <wps:txbx>
-                        <w:txbxContent>
-                          <w:p>
-                            <w:r>
-                              <w:t>Skill 3:</w:t>
-                            </w:r>
-                          </w:p>
-                        </w:txbxContent>
-                      </wps:txbx>
-                      <wps:bodyPr rot="0" vert="horz" wrap="square" lIns="91440" tIns="45720" rIns="91440" bIns="45720" anchor="t" anchorCtr="0">
-                        <a:noAutofit/>
-                      </wps:bodyPr>
-                    </wps:wsp>
-                  </a:graphicData>
-                </a:graphic>
-                <wp14:sizeRelH relativeFrom="margin">
-                  <wp14:pctWidth>0</wp14:pctWidth>
-                </wp14:sizeRelH>
-                <wp14:sizeRelV relativeFrom="margin">
-                  <wp14:pctHeight>0</wp14:pctHeight>
-                </wp14:sizeRelV>
-              </wp:anchor>
-            </w:drawing>
-          </mc:Choice>
-          <mc:Fallback>
-            <w:pict>
-              <v:shape w14:anchorId="298843EE" id="_x0000_s1031" type="#_x0000_t202" style="position:absolute;margin-left:0;margin-top:12.95pt;width:145.8pt;height:20.4pt;z-index:251665408;visibility:visible;mso-wrap-style:square;mso-width-percent:0;mso-height-percent:0;mso-wrap-distance-left:9pt;mso-wrap-distance-top:3.6pt;mso-wrap-distance-right:9pt;mso-wrap-distance-bottom:3.6pt;mso-position-horizontal:left;mso-position-horizontal-relative:margin;mso-position-vertical:absolute;mso-position-vertical-relative:text;mso-width-percent:0;mso-height-percent:0;mso-width-relative:margin;mso-height-relative:margin;v-text-anchor:top" o:gfxdata="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">
-                <v:textbox>
-                  <w:txbxContent>
-                    <w:p>
-                      <w:r>
-                        <w:t>Skill 3:</w:t>
-                      </w:r>
-                    </w:p>
-                  </w:txbxContent>
-                </v:textbox>
-                <w10:wrap type="square" anchorx="margin"/>
-              </v:shape>
-            </w:pict>
-          </mc:Fallback>
-        </mc:AlternateContent>
-      </w:r>
-    </w:p>
-    <w:p>
-      <w:pPr>
-        <w:rPr>
-          <w:rFonts w:ascii="Arial" w:hAnsi="Arial" w:cs="Arial"/>
-          <w:sz w:val="24"/>
-          <w:szCs w:val="24"/>
-        </w:rPr>
-      </w:pPr>
-    </w:p>
-    <w:p>
-      <w:pPr>
-        <w:jc w:val="center"/>
         <w:rPr>
           <w:rFonts w:ascii="Arial" w:hAnsi="Arial" w:cs="Arial"/>
           <w:sz w:val="24"/>
@@ -888,6 +1157,9 @@
         <w:gridCol w:w="9016"/>
       </w:tblGrid>
       <w:tr>
+        <w:trPr>
+          <w:trHeight w:val="2842"/>
+        </w:trPr>
         <w:tc>
           <w:tcPr>
             <w:tcW w:w="9016" w:type="dxa"/>
@@ -964,9 +1236,45 @@
               </w:rPr>
             </w:pPr>
           </w:p>
+          <w:p>
+            <w:pPr>
+              <w:rPr>
+                <w:rFonts w:ascii="Arial" w:hAnsi="Arial" w:cs="Arial"/>
+                <w:sz w:val="24"/>
+                <w:szCs w:val="24"/>
+              </w:rPr>
+            </w:pPr>
+          </w:p>
+          <w:p>
+            <w:pPr>
+              <w:rPr>
+                <w:rFonts w:ascii="Arial" w:hAnsi="Arial" w:cs="Arial"/>
+                <w:sz w:val="24"/>
+                <w:szCs w:val="24"/>
+              </w:rPr>
+            </w:pPr>
+          </w:p>
         </w:tc>
       </w:tr>
     </w:tbl>
+    <w:p>
+      <w:pPr>
+        <w:rPr>
+          <w:rFonts w:ascii="Arial" w:hAnsi="Arial" w:cs="Arial"/>
+          <w:sz w:val="24"/>
+          <w:szCs w:val="24"/>
+        </w:rPr>
+      </w:pPr>
+    </w:p>
+    <w:p>
+      <w:pPr>
+        <w:rPr>
+          <w:rFonts w:ascii="Arial" w:hAnsi="Arial" w:cs="Arial"/>
+          <w:sz w:val="24"/>
+          <w:szCs w:val="24"/>
+        </w:rPr>
+      </w:pPr>
+    </w:p>
     <w:p>
       <w:pPr>
         <w:rPr>
@@ -995,6 +1303,7 @@
           <w:sz w:val="24"/>
           <w:szCs w:val="24"/>
         </w:rPr>
+        <w:lastRenderedPageBreak/>
         <w:t>Complete the following</w:t>
       </w:r>
       <w:r>
@@ -1039,15 +1348,6 @@
         </w:rPr>
         <w:t>2.2]:</w:t>
       </w:r>
-    </w:p>
-    <w:p>
-      <w:pPr>
-        <w:rPr>
-          <w:rFonts w:ascii="Arial" w:hAnsi="Arial" w:cs="Arial"/>
-          <w:sz w:val="24"/>
-          <w:szCs w:val="24"/>
-        </w:rPr>
-      </w:pPr>
     </w:p>
     <w:tbl>
       <w:tblPr>
@@ -1413,6 +1713,15 @@
     </w:p>
     <w:p>
       <w:pPr>
+        <w:rPr>
+          <w:rFonts w:ascii="Arial" w:hAnsi="Arial" w:cs="Arial"/>
+          <w:sz w:val="24"/>
+          <w:szCs w:val="24"/>
+        </w:rPr>
+      </w:pPr>
+    </w:p>
+    <w:p>
+      <w:pPr>
         <w:pStyle w:val="ListParagraph"/>
         <w:numPr>
           <w:ilvl w:val="0"/>
@@ -1564,15 +1873,47 @@
           <w:sz w:val="24"/>
           <w:szCs w:val="24"/>
         </w:rPr>
-        <w:t xml:space="preserve">To help you, you may research cyber security jobs adverts and descriptions </w:t>
-      </w:r>
-      <w:r>
-        <w:rPr>
-          <w:rFonts w:ascii="Arial" w:hAnsi="Arial" w:cs="Arial"/>
-          <w:sz w:val="24"/>
-          <w:szCs w:val="24"/>
-        </w:rPr>
-        <w:t>or if you’re already employed in a firm with cyber security staff you could ask them.</w:t>
+        <w:t>To help you, you may research cyber security jobs adverts and descriptions</w:t>
+      </w:r>
+      <w:r>
+        <w:rPr>
+          <w:rFonts w:ascii="Arial" w:hAnsi="Arial" w:cs="Arial"/>
+          <w:sz w:val="24"/>
+          <w:szCs w:val="24"/>
+        </w:rPr>
+        <w:t>,</w:t>
+      </w:r>
+      <w:r>
+        <w:rPr>
+          <w:rFonts w:ascii="Arial" w:hAnsi="Arial" w:cs="Arial"/>
+          <w:sz w:val="24"/>
+          <w:szCs w:val="24"/>
+        </w:rPr>
+        <w:t xml:space="preserve"> </w:t>
+      </w:r>
+      <w:r>
+        <w:rPr>
+          <w:rFonts w:ascii="Arial" w:hAnsi="Arial" w:cs="Arial"/>
+          <w:sz w:val="24"/>
+          <w:szCs w:val="24"/>
+        </w:rPr>
+        <w:t>or if you’re already employed in a firm with cyber security staff</w:t>
+      </w:r>
+      <w:r>
+        <w:rPr>
+          <w:rFonts w:ascii="Arial" w:hAnsi="Arial" w:cs="Arial"/>
+          <w:sz w:val="24"/>
+          <w:szCs w:val="24"/>
+        </w:rPr>
+        <w:t xml:space="preserve">, </w:t>
+      </w:r>
+      <w:r>
+        <w:rPr>
+          <w:rFonts w:ascii="Arial" w:hAnsi="Arial" w:cs="Arial"/>
+          <w:sz w:val="24"/>
+          <w:szCs w:val="24"/>
+        </w:rPr>
+        <w:t>you could ask them.</w:t>
       </w:r>
     </w:p>
     <w:tbl>
@@ -1719,6 +2060,7 @@
           <w:sz w:val="24"/>
           <w:szCs w:val="24"/>
         </w:rPr>
+        <w:lastRenderedPageBreak/>
         <w:t>Finally create a personal development plan</w:t>
       </w:r>
       <w:r>
@@ -1779,15 +2121,6 @@
         </w:rPr>
         <w:t xml:space="preserve"> </w:t>
       </w:r>
-    </w:p>
-    <w:p>
-      <w:pPr>
-        <w:rPr>
-          <w:rFonts w:ascii="Arial" w:hAnsi="Arial" w:cs="Arial"/>
-          <w:sz w:val="24"/>
-          <w:szCs w:val="24"/>
-        </w:rPr>
-      </w:pPr>
     </w:p>
     <w:tbl>
       <w:tblPr>
@@ -1925,7 +2258,7 @@
     </w:p>
     <w:p>
       <w:pPr>
-        <w:spacing w:line="360" w:lineRule="auto"/>
+        <w:spacing w:line="240" w:lineRule="auto"/>
         <w:rPr>
           <w:rFonts w:ascii="Arial" w:hAnsi="Arial" w:cs="Arial"/>
           <w:b/>
@@ -1967,7 +2300,7 @@
     </w:p>
     <w:p>
       <w:pPr>
-        <w:spacing w:line="360" w:lineRule="auto"/>
+        <w:spacing w:line="240" w:lineRule="auto"/>
         <w:rPr>
           <w:rFonts w:ascii="Arial" w:hAnsi="Arial" w:cs="Arial"/>
           <w:b/>
@@ -2008,7 +2341,7 @@
 </file>
 
 <file path=word/endnotes.xml><?xml version="1.0" encoding="utf-8"?>
-<w:endnotes xmlns:wpc="http://schemas.microsoft.com/office/word/2010/wordprocessingCanvas" xmlns:cx="http://schemas.microsoft.com/office/drawing/2014/chartex" xmlns:cx1="http://schemas.microsoft.com/office/drawing/2015/9/8/chartex" xmlns:cx2="http://schemas.microsoft.com/office/drawing/2015/10/21/chartex" xmlns:cx3="http://schemas.microsoft.com/office/drawing/2016/5/9/chartex" xmlns:cx4="http://schemas.microsoft.com/office/drawing/2016/5/10/chartex" xmlns:cx5="http://schemas.microsoft.com/office/drawing/2016/5/11/chartex" xmlns:cx6="http://schemas.microsoft.com/office/drawing/2016/5/12/chartex" xmlns:cx7="http://schemas.microsoft.com/office/drawing/2016/5/13/chartex" xmlns:cx8="http://schemas.microsoft.com/office/drawing/2016/5/14/chartex" xmlns:mc="http://schemas.openxmlformats.org/markup-compatibility/2006" xmlns:aink="http://schemas.microsoft.com/office/drawing/2016/ink" xmlns:am3d="http://schemas.microsoft.com/office/drawing/2017/model3d" xmlns:o="urn:schemas-microsoft-com:office:office" xmlns:oel="http://schemas.microsoft.com/office/2019/extlst" xmlns:r="http://schemas.openxmlformats.org/officeDocument/2006/relationships" xmlns:m="http://schemas.openxmlformats.org/officeDocument/2006/math" xmlns:v="urn:schemas-microsoft-com:vml" xmlns:wp14="http://schemas.microsoft.com/office/word/2010/wordprocessingDrawing" xmlns:wp="http://schemas.openxmlformats.org/drawingml/2006/wordprocessingDrawing" xmlns:w10="urn:schemas-microsoft-com:office:word" xmlns:w="http://schemas.openxmlformats.org/wordprocessingml/2006/main" xmlns:w14="http://schemas.microsoft.com/office/word/2010/wordml" xmlns:w15="http://schemas.microsoft.com/office/word/2012/wordml" xmlns:w16cex="http://schemas.microsoft.com/office/word/2018/wordml/cex" xmlns:w16cid="http://schemas.microsoft.com/office/word/2016/wordml/cid" xmlns:w16="http://schemas.microsoft.com/office/word/2018/wordml" xmlns:w16sdtdh="http://schemas.microsoft.com/office/word/2020/wordml/sdtdatahash" xmlns:w16se="http://schemas.microsoft.com/office/word/2015/wordml/symex" xmlns:wpg="http://schemas.microsoft.com/office/word/2010/wordprocessingGroup" xmlns:wpi="http://schemas.microsoft.com/office/word/2010/wordprocessingInk" xmlns:wne="http://schemas.microsoft.com/office/word/2006/wordml" xmlns:wps="http://schemas.microsoft.com/office/word/2010/wordprocessingShape" mc:Ignorable="w14 w15 w16se w16cid w16 w16cex w16sdtdh wp14">
+<w:endnotes xmlns:wpc="http://schemas.microsoft.com/office/word/2010/wordprocessingCanvas" xmlns:cx="http://schemas.microsoft.com/office/drawing/2014/chartex" xmlns:cx1="http://schemas.microsoft.com/office/drawing/2015/9/8/chartex" xmlns:cx2="http://schemas.microsoft.com/office/drawing/2015/10/21/chartex" xmlns:cx3="http://schemas.microsoft.com/office/drawing/2016/5/9/chartex" xmlns:cx4="http://schemas.microsoft.com/office/drawing/2016/5/10/chartex" xmlns:cx5="http://schemas.microsoft.com/office/drawing/2016/5/11/chartex" xmlns:cx6="http://schemas.microsoft.com/office/drawing/2016/5/12/chartex" xmlns:cx7="http://schemas.microsoft.com/office/drawing/2016/5/13/chartex" xmlns:cx8="http://schemas.microsoft.com/office/drawing/2016/5/14/chartex" xmlns:mc="http://schemas.openxmlformats.org/markup-compatibility/2006" xmlns:aink="http://schemas.microsoft.com/office/drawing/2016/ink" xmlns:am3d="http://schemas.microsoft.com/office/drawing/2017/model3d" xmlns:o="urn:schemas-microsoft-com:office:office" xmlns:r="http://schemas.openxmlformats.org/officeDocument/2006/relationships" xmlns:m="http://schemas.openxmlformats.org/officeDocument/2006/math" xmlns:v="urn:schemas-microsoft-com:vml" xmlns:wp14="http://schemas.microsoft.com/office/word/2010/wordprocessingDrawing" xmlns:wp="http://schemas.openxmlformats.org/drawingml/2006/wordprocessingDrawing" xmlns:w10="urn:schemas-microsoft-com:office:word" xmlns:w="http://schemas.openxmlformats.org/wordprocessingml/2006/main" xmlns:w14="http://schemas.microsoft.com/office/word/2010/wordml" xmlns:w15="http://schemas.microsoft.com/office/word/2012/wordml" xmlns:w16cex="http://schemas.microsoft.com/office/word/2018/wordml/cex" xmlns:w16cid="http://schemas.microsoft.com/office/word/2016/wordml/cid" xmlns:w16="http://schemas.microsoft.com/office/word/2018/wordml" xmlns:w16sdtdh="http://schemas.microsoft.com/office/word/2020/wordml/sdtdatahash" xmlns:w16se="http://schemas.microsoft.com/office/word/2015/wordml/symex" xmlns:wpg="http://schemas.microsoft.com/office/word/2010/wordprocessingGroup" xmlns:wpi="http://schemas.microsoft.com/office/word/2010/wordprocessingInk" xmlns:wne="http://schemas.microsoft.com/office/word/2006/wordml" xmlns:wps="http://schemas.microsoft.com/office/word/2010/wordprocessingShape" mc:Ignorable="w14 w15 w16se w16cid w16 w16cex w16sdtdh wp14">
   <w:endnote w:type="separator" w:id="-1">
     <w:p>
       <w:pPr>
@@ -2033,7 +2366,7 @@
 </file>
 
 <file path=word/footnotes.xml><?xml version="1.0" encoding="utf-8"?>
-<w:footnotes xmlns:wpc="http://schemas.microsoft.com/office/word/2010/wordprocessingCanvas" xmlns:cx="http://schemas.microsoft.com/office/drawing/2014/chartex" xmlns:cx1="http://schemas.microsoft.com/office/drawing/2015/9/8/chartex" xmlns:cx2="http://schemas.microsoft.com/office/drawing/2015/10/21/chartex" xmlns:cx3="http://schemas.microsoft.com/office/drawing/2016/5/9/chartex" xmlns:cx4="http://schemas.microsoft.com/office/drawing/2016/5/10/chartex" xmlns:cx5="http://schemas.microsoft.com/office/drawing/2016/5/11/chartex" xmlns:cx6="http://schemas.microsoft.com/office/drawing/2016/5/12/chartex" xmlns:cx7="http://schemas.microsoft.com/office/drawing/2016/5/13/chartex" xmlns:cx8="http://schemas.microsoft.com/office/drawing/2016/5/14/chartex" xmlns:mc="http://schemas.openxmlformats.org/markup-compatibility/2006" xmlns:aink="http://schemas.microsoft.com/office/drawing/2016/ink" xmlns:am3d="http://schemas.microsoft.com/office/drawing/2017/model3d" xmlns:o="urn:schemas-microsoft-com:office:office" xmlns:oel="http://schemas.microsoft.com/office/2019/extlst" xmlns:r="http://schemas.openxmlformats.org/officeDocument/2006/relationships" xmlns:m="http://schemas.openxmlformats.org/officeDocument/2006/math" xmlns:v="urn:schemas-microsoft-com:vml" xmlns:wp14="http://schemas.microsoft.com/office/word/2010/wordprocessingDrawing" xmlns:wp="http://schemas.openxmlformats.org/drawingml/2006/wordprocessingDrawing" xmlns:w10="urn:schemas-microsoft-com:office:word" xmlns:w="http://schemas.openxmlformats.org/wordprocessingml/2006/main" xmlns:w14="http://schemas.microsoft.com/office/word/2010/wordml" xmlns:w15="http://schemas.microsoft.com/office/word/2012/wordml" xmlns:w16cex="http://schemas.microsoft.com/office/word/2018/wordml/cex" xmlns:w16cid="http://schemas.microsoft.com/office/word/2016/wordml/cid" xmlns:w16="http://schemas.microsoft.com/office/word/2018/wordml" xmlns:w16sdtdh="http://schemas.microsoft.com/office/word/2020/wordml/sdtdatahash" xmlns:w16se="http://schemas.microsoft.com/office/word/2015/wordml/symex" xmlns:wpg="http://schemas.microsoft.com/office/word/2010/wordprocessingGroup" xmlns:wpi="http://schemas.microsoft.com/office/word/2010/wordprocessingInk" xmlns:wne="http://schemas.microsoft.com/office/word/2006/wordml" xmlns:wps="http://schemas.microsoft.com/office/word/2010/wordprocessingShape" mc:Ignorable="w14 w15 w16se w16cid w16 w16cex w16sdtdh wp14">
+<w:footnotes xmlns:wpc="http://schemas.microsoft.com/office/word/2010/wordprocessingCanvas" xmlns:cx="http://schemas.microsoft.com/office/drawing/2014/chartex" xmlns:cx1="http://schemas.microsoft.com/office/drawing/2015/9/8/chartex" xmlns:cx2="http://schemas.microsoft.com/office/drawing/2015/10/21/chartex" xmlns:cx3="http://schemas.microsoft.com/office/drawing/2016/5/9/chartex" xmlns:cx4="http://schemas.microsoft.com/office/drawing/2016/5/10/chartex" xmlns:cx5="http://schemas.microsoft.com/office/drawing/2016/5/11/chartex" xmlns:cx6="http://schemas.microsoft.com/office/drawing/2016/5/12/chartex" xmlns:cx7="http://schemas.microsoft.com/office/drawing/2016/5/13/chartex" xmlns:cx8="http://schemas.microsoft.com/office/drawing/2016/5/14/chartex" xmlns:mc="http://schemas.openxmlformats.org/markup-compatibility/2006" xmlns:aink="http://schemas.microsoft.com/office/drawing/2016/ink" xmlns:am3d="http://schemas.microsoft.com/office/drawing/2017/model3d" xmlns:o="urn:schemas-microsoft-com:office:office" xmlns:r="http://schemas.openxmlformats.org/officeDocument/2006/relationships" xmlns:m="http://schemas.openxmlformats.org/officeDocument/2006/math" xmlns:v="urn:schemas-microsoft-com:vml" xmlns:wp14="http://schemas.microsoft.com/office/word/2010/wordprocessingDrawing" xmlns:wp="http://schemas.openxmlformats.org/drawingml/2006/wordprocessingDrawing" xmlns:w10="urn:schemas-microsoft-com:office:word" xmlns:w="http://schemas.openxmlformats.org/wordprocessingml/2006/main" xmlns:w14="http://schemas.microsoft.com/office/word/2010/wordml" xmlns:w15="http://schemas.microsoft.com/office/word/2012/wordml" xmlns:w16cex="http://schemas.microsoft.com/office/word/2018/wordml/cex" xmlns:w16cid="http://schemas.microsoft.com/office/word/2016/wordml/cid" xmlns:w16="http://schemas.microsoft.com/office/word/2018/wordml" xmlns:w16sdtdh="http://schemas.microsoft.com/office/word/2020/wordml/sdtdatahash" xmlns:w16se="http://schemas.microsoft.com/office/word/2015/wordml/symex" xmlns:wpg="http://schemas.microsoft.com/office/word/2010/wordprocessingGroup" xmlns:wpi="http://schemas.microsoft.com/office/word/2010/wordprocessingInk" xmlns:wne="http://schemas.microsoft.com/office/word/2006/wordml" xmlns:wps="http://schemas.microsoft.com/office/word/2010/wordprocessingShape" mc:Ignorable="w14 w15 w16se w16cid w16 w16cex w16sdtdh wp14">
   <w:footnote w:type="separator" w:id="-1">
     <w:p>
       <w:pPr>
@@ -2058,7 +2391,7 @@
 </file>
 
 <file path=word/header1.xml><?xml version="1.0" encoding="utf-8"?>
-<w:hdr xmlns:wpc="http://schemas.microsoft.com/office/word/2010/wordprocessingCanvas" xmlns:cx="http://schemas.microsoft.com/office/drawing/2014/chartex" xmlns:cx1="http://schemas.microsoft.com/office/drawing/2015/9/8/chartex" xmlns:cx2="http://schemas.microsoft.com/office/drawing/2015/10/21/chartex" xmlns:cx3="http://schemas.microsoft.com/office/drawing/2016/5/9/chartex" xmlns:cx4="http://schemas.microsoft.com/office/drawing/2016/5/10/chartex" xmlns:cx5="http://schemas.microsoft.com/office/drawing/2016/5/11/chartex" xmlns:cx6="http://schemas.microsoft.com/office/drawing/2016/5/12/chartex" xmlns:cx7="http://schemas.microsoft.com/office/drawing/2016/5/13/chartex" xmlns:cx8="http://schemas.microsoft.com/office/drawing/2016/5/14/chartex" xmlns:mc="http://schemas.openxmlformats.org/markup-compatibility/2006" xmlns:aink="http://schemas.microsoft.com/office/drawing/2016/ink" xmlns:am3d="http://schemas.microsoft.com/office/drawing/2017/model3d" xmlns:o="urn:schemas-microsoft-com:office:office" xmlns:oel="http://schemas.microsoft.com/office/2019/extlst" xmlns:r="http://schemas.openxmlformats.org/officeDocument/2006/relationships" xmlns:m="http://schemas.openxmlformats.org/officeDocument/2006/math" xmlns:v="urn:schemas-microsoft-com:vml" xmlns:wp14="http://schemas.microsoft.com/office/word/2010/wordprocessingDrawing" xmlns:wp="http://schemas.openxmlformats.org/drawingml/2006/wordprocessingDrawing" xmlns:w10="urn:schemas-microsoft-com:office:word" xmlns:w="http://schemas.openxmlformats.org/wordprocessingml/2006/main" xmlns:w14="http://schemas.microsoft.com/office/word/2010/wordml" xmlns:w15="http://schemas.microsoft.com/office/word/2012/wordml" xmlns:w16cex="http://schemas.microsoft.com/office/word/2018/wordml/cex" xmlns:w16cid="http://schemas.microsoft.com/office/word/2016/wordml/cid" xmlns:w16="http://schemas.microsoft.com/office/word/2018/wordml" xmlns:w16sdtdh="http://schemas.microsoft.com/office/word/2020/wordml/sdtdatahash" xmlns:w16se="http://schemas.microsoft.com/office/word/2015/wordml/symex" xmlns:wpg="http://schemas.microsoft.com/office/word/2010/wordprocessingGroup" xmlns:wpi="http://schemas.microsoft.com/office/word/2010/wordprocessingInk" xmlns:wne="http://schemas.microsoft.com/office/word/2006/wordml" xmlns:wps="http://schemas.microsoft.com/office/word/2010/wordprocessingShape" mc:Ignorable="w14 w15 w16se w16cid w16 w16cex w16sdtdh wp14">
+<w:hdr xmlns:wpc="http://schemas.microsoft.com/office/word/2010/wordprocessingCanvas" xmlns:cx="http://schemas.microsoft.com/office/drawing/2014/chartex" xmlns:cx1="http://schemas.microsoft.com/office/drawing/2015/9/8/chartex" xmlns:cx2="http://schemas.microsoft.com/office/drawing/2015/10/21/chartex" xmlns:cx3="http://schemas.microsoft.com/office/drawing/2016/5/9/chartex" xmlns:cx4="http://schemas.microsoft.com/office/drawing/2016/5/10/chartex" xmlns:cx5="http://schemas.microsoft.com/office/drawing/2016/5/11/chartex" xmlns:cx6="http://schemas.microsoft.com/office/drawing/2016/5/12/chartex" xmlns:cx7="http://schemas.microsoft.com/office/drawing/2016/5/13/chartex" xmlns:cx8="http://schemas.microsoft.com/office/drawing/2016/5/14/chartex" xmlns:mc="http://schemas.openxmlformats.org/markup-compatibility/2006" xmlns:aink="http://schemas.microsoft.com/office/drawing/2016/ink" xmlns:am3d="http://schemas.microsoft.com/office/drawing/2017/model3d" xmlns:o="urn:schemas-microsoft-com:office:office" xmlns:r="http://schemas.openxmlformats.org/officeDocument/2006/relationships" xmlns:m="http://schemas.openxmlformats.org/officeDocument/2006/math" xmlns:v="urn:schemas-microsoft-com:vml" xmlns:wp14="http://schemas.microsoft.com/office/word/2010/wordprocessingDrawing" xmlns:wp="http://schemas.openxmlformats.org/drawingml/2006/wordprocessingDrawing" xmlns:w10="urn:schemas-microsoft-com:office:word" xmlns:w="http://schemas.openxmlformats.org/wordprocessingml/2006/main" xmlns:w14="http://schemas.microsoft.com/office/word/2010/wordml" xmlns:w15="http://schemas.microsoft.com/office/word/2012/wordml" xmlns:w16cex="http://schemas.microsoft.com/office/word/2018/wordml/cex" xmlns:w16cid="http://schemas.microsoft.com/office/word/2016/wordml/cid" xmlns:w16="http://schemas.microsoft.com/office/word/2018/wordml" xmlns:w16sdtdh="http://schemas.microsoft.com/office/word/2020/wordml/sdtdatahash" xmlns:w16se="http://schemas.microsoft.com/office/word/2015/wordml/symex" xmlns:wpg="http://schemas.microsoft.com/office/word/2010/wordprocessingGroup" xmlns:wpi="http://schemas.microsoft.com/office/word/2010/wordprocessingInk" xmlns:wne="http://schemas.microsoft.com/office/word/2006/wordml" xmlns:wps="http://schemas.microsoft.com/office/word/2010/wordprocessingShape" mc:Ignorable="w14 w15 w16se w16cid w16 w16cex w16sdtdh wp14">
   <w:p>
     <w:pPr>
       <w:pStyle w:val="Header"/>
@@ -2156,7 +2489,7 @@
 </file>
 
 <file path=word/numbering.xml><?xml version="1.0" encoding="utf-8"?>
-<w:numbering xmlns:wpc="http://schemas.microsoft.com/office/word/2010/wordprocessingCanvas" xmlns:cx="http://schemas.microsoft.com/office/drawing/2014/chartex" xmlns:cx1="http://schemas.microsoft.com/office/drawing/2015/9/8/chartex" xmlns:cx2="http://schemas.microsoft.com/office/drawing/2015/10/21/chartex" xmlns:cx3="http://schemas.microsoft.com/office/drawing/2016/5/9/chartex" xmlns:cx4="http://schemas.microsoft.com/office/drawing/2016/5/10/chartex" xmlns:cx5="http://schemas.microsoft.com/office/drawing/2016/5/11/chartex" xmlns:cx6="http://schemas.microsoft.com/office/drawing/2016/5/12/chartex" xmlns:cx7="http://schemas.microsoft.com/office/drawing/2016/5/13/chartex" xmlns:cx8="http://schemas.microsoft.com/office/drawing/2016/5/14/chartex" xmlns:mc="http://schemas.openxmlformats.org/markup-compatibility/2006" xmlns:aink="http://schemas.microsoft.com/office/drawing/2016/ink" xmlns:am3d="http://schemas.microsoft.com/office/drawing/2017/model3d" xmlns:o="urn:schemas-microsoft-com:office:office" xmlns:oel="http://schemas.microsoft.com/office/2019/extlst" xmlns:r="http://schemas.openxmlformats.org/officeDocument/2006/relationships" xmlns:m="http://schemas.openxmlformats.org/officeDocument/2006/math" xmlns:v="urn:schemas-microsoft-com:vml" xmlns:wp14="http://schemas.microsoft.com/office/word/2010/wordprocessingDrawing" xmlns:wp="http://schemas.openxmlformats.org/drawingml/2006/wordprocessingDrawing" xmlns:w10="urn:schemas-microsoft-com:office:word" xmlns:w="http://schemas.openxmlformats.org/wordprocessingml/2006/main" xmlns:w14="http://schemas.microsoft.com/office/word/2010/wordml" xmlns:w15="http://schemas.microsoft.com/office/word/2012/wordml" xmlns:w16cex="http://schemas.microsoft.com/office/word/2018/wordml/cex" xmlns:w16cid="http://schemas.microsoft.com/office/word/2016/wordml/cid" xmlns:w16="http://schemas.microsoft.com/office/word/2018/wordml" xmlns:w16sdtdh="http://schemas.microsoft.com/office/word/2020/wordml/sdtdatahash" xmlns:w16se="http://schemas.microsoft.com/office/word/2015/wordml/symex" xmlns:wpg="http://schemas.microsoft.com/office/word/2010/wordprocessingGroup" xmlns:wpi="http://schemas.microsoft.com/office/word/2010/wordprocessingInk" xmlns:wne="http://schemas.microsoft.com/office/word/2006/wordml" xmlns:wps="http://schemas.microsoft.com/office/word/2010/wordprocessingShape" mc:Ignorable="w14 w15 w16se w16cid w16 w16cex w16sdtdh wp14">
+<w:numbering xmlns:wpc="http://schemas.microsoft.com/office/word/2010/wordprocessingCanvas" xmlns:cx="http://schemas.microsoft.com/office/drawing/2014/chartex" xmlns:cx1="http://schemas.microsoft.com/office/drawing/2015/9/8/chartex" xmlns:cx2="http://schemas.microsoft.com/office/drawing/2015/10/21/chartex" xmlns:cx3="http://schemas.microsoft.com/office/drawing/2016/5/9/chartex" xmlns:cx4="http://schemas.microsoft.com/office/drawing/2016/5/10/chartex" xmlns:cx5="http://schemas.microsoft.com/office/drawing/2016/5/11/chartex" xmlns:cx6="http://schemas.microsoft.com/office/drawing/2016/5/12/chartex" xmlns:cx7="http://schemas.microsoft.com/office/drawing/2016/5/13/chartex" xmlns:cx8="http://schemas.microsoft.com/office/drawing/2016/5/14/chartex" xmlns:mc="http://schemas.openxmlformats.org/markup-compatibility/2006" xmlns:aink="http://schemas.microsoft.com/office/drawing/2016/ink" xmlns:am3d="http://schemas.microsoft.com/office/drawing/2017/model3d" xmlns:o="urn:schemas-microsoft-com:office:office" xmlns:r="http://schemas.openxmlformats.org/officeDocument/2006/relationships" xmlns:m="http://schemas.openxmlformats.org/officeDocument/2006/math" xmlns:v="urn:schemas-microsoft-com:vml" xmlns:wp14="http://schemas.microsoft.com/office/word/2010/wordprocessingDrawing" xmlns:wp="http://schemas.openxmlformats.org/drawingml/2006/wordprocessingDrawing" xmlns:w10="urn:schemas-microsoft-com:office:word" xmlns:w="http://schemas.openxmlformats.org/wordprocessingml/2006/main" xmlns:w14="http://schemas.microsoft.com/office/word/2010/wordml" xmlns:w15="http://schemas.microsoft.com/office/word/2012/wordml" xmlns:w16cex="http://schemas.microsoft.com/office/word/2018/wordml/cex" xmlns:w16cid="http://schemas.microsoft.com/office/word/2016/wordml/cid" xmlns:w16="http://schemas.microsoft.com/office/word/2018/wordml" xmlns:w16sdtdh="http://schemas.microsoft.com/office/word/2020/wordml/sdtdatahash" xmlns:w16se="http://schemas.microsoft.com/office/word/2015/wordml/symex" xmlns:wpg="http://schemas.microsoft.com/office/word/2010/wordprocessingGroup" xmlns:wpi="http://schemas.microsoft.com/office/word/2010/wordprocessingInk" xmlns:wne="http://schemas.microsoft.com/office/word/2006/wordml" xmlns:wps="http://schemas.microsoft.com/office/word/2010/wordprocessingShape" mc:Ignorable="w14 w15 w16se w16cid w16 w16cex w16sdtdh wp14">
   <w:abstractNum w:abstractNumId="0" w15:restartNumberingAfterBreak="0">
     <w:nsid w:val="08BD79A1"/>
     <w:multiLevelType w:val="hybridMultilevel"/>
@@ -2256,7 +2589,7 @@
       <w:lvlText w:val=""/>
       <w:lvlJc w:val="left"/>
       <w:pPr>
-        <w:ind w:left="1080" w:hanging="360"/>
+        <w:ind w:left="720" w:hanging="360"/>
       </w:pPr>
       <w:rPr>
         <w:rFonts w:ascii="Symbol" w:hAnsi="Symbol" w:hint="default"/>
@@ -2268,7 +2601,7 @@
       <w:lvlText w:val="o"/>
       <w:lvlJc w:val="left"/>
       <w:pPr>
-        <w:ind w:left="1800" w:hanging="360"/>
+        <w:ind w:left="1440" w:hanging="360"/>
       </w:pPr>
       <w:rPr>
         <w:rFonts w:ascii="Courier New" w:hAnsi="Courier New" w:cs="Courier New" w:hint="default"/>
@@ -2280,7 +2613,7 @@
       <w:lvlText w:val=""/>
       <w:lvlJc w:val="left"/>
       <w:pPr>
-        <w:ind w:left="2520" w:hanging="360"/>
+        <w:ind w:left="2160" w:hanging="360"/>
       </w:pPr>
       <w:rPr>
         <w:rFonts w:ascii="Wingdings" w:hAnsi="Wingdings" w:hint="default"/>
@@ -2292,7 +2625,7 @@
       <w:lvlText w:val=""/>
       <w:lvlJc w:val="left"/>
       <w:pPr>
-        <w:ind w:left="3240" w:hanging="360"/>
+        <w:ind w:left="2880" w:hanging="360"/>
       </w:pPr>
       <w:rPr>
         <w:rFonts w:ascii="Symbol" w:hAnsi="Symbol" w:hint="default"/>
@@ -2304,7 +2637,7 @@
       <w:lvlText w:val="o"/>
       <w:lvlJc w:val="left"/>
       <w:pPr>
-        <w:ind w:left="3960" w:hanging="360"/>
+        <w:ind w:left="3600" w:hanging="360"/>
       </w:pPr>
       <w:rPr>
         <w:rFonts w:ascii="Courier New" w:hAnsi="Courier New" w:cs="Courier New" w:hint="default"/>
@@ -2316,7 +2649,7 @@
       <w:lvlText w:val=""/>
       <w:lvlJc w:val="left"/>
       <w:pPr>
-        <w:ind w:left="4680" w:hanging="360"/>
+        <w:ind w:left="4320" w:hanging="360"/>
       </w:pPr>
       <w:rPr>
         <w:rFonts w:ascii="Wingdings" w:hAnsi="Wingdings" w:hint="default"/>
@@ -2328,7 +2661,7 @@
       <w:lvlText w:val=""/>
       <w:lvlJc w:val="left"/>
       <w:pPr>
-        <w:ind w:left="5400" w:hanging="360"/>
+        <w:ind w:left="5040" w:hanging="360"/>
       </w:pPr>
       <w:rPr>
         <w:rFonts w:ascii="Symbol" w:hAnsi="Symbol" w:hint="default"/>
@@ -2340,7 +2673,7 @@
       <w:lvlText w:val="o"/>
       <w:lvlJc w:val="left"/>
       <w:pPr>
-        <w:ind w:left="6120" w:hanging="360"/>
+        <w:ind w:left="5760" w:hanging="360"/>
       </w:pPr>
       <w:rPr>
         <w:rFonts w:ascii="Courier New" w:hAnsi="Courier New" w:cs="Courier New" w:hint="default"/>
@@ -2352,17 +2685,17 @@
       <w:lvlText w:val=""/>
       <w:lvlJc w:val="left"/>
       <w:pPr>
-        <w:ind w:left="6840" w:hanging="360"/>
+        <w:ind w:left="6480" w:hanging="360"/>
       </w:pPr>
       <w:rPr>
         <w:rFonts w:ascii="Wingdings" w:hAnsi="Wingdings" w:hint="default"/>
       </w:rPr>
     </w:lvl>
   </w:abstractNum>
-  <w:num w:numId="1" w16cid:durableId="428240098">
+  <w:num w:numId="1">
     <w:abstractNumId w:val="0"/>
   </w:num>
-  <w:num w:numId="2" w16cid:durableId="1837306277">
+  <w:num w:numId="2">
     <w:abstractNumId w:val="1"/>
   </w:num>
 </w:numbering>

</xml_diff>

<commit_message>
Cyber3 - Unit 6 - Word doc update
</commit_message>
<xml_diff>
--- a/src/site/pdfs/cs3_u6_s2_assessment_personal_skills.docx
+++ b/src/site/pdfs/cs3_u6_s2_assessment_personal_skills.docx
@@ -1328,7 +1328,7 @@
           <w:sz w:val="24"/>
           <w:szCs w:val="24"/>
         </w:rPr>
-        <w:t xml:space="preserve">. This has been designed as a SOAR, but you can change it to a SWOT if you prefer – simply amend the headings </w:t>
+        <w:t xml:space="preserve">. This has been designed as a SWOT, but you can change it to a SOAR if you prefer – simply amend the headings </w:t>
       </w:r>
       <w:r>
         <w:rPr>
@@ -1409,7 +1409,7 @@
                 <w:sz w:val="24"/>
                 <w:szCs w:val="24"/>
               </w:rPr>
-              <w:t>Opportunity</w:t>
+              <w:t>Weaknesses</w:t>
             </w:r>
             <w:r>
               <w:rPr>
@@ -1551,7 +1551,7 @@
                 <w:sz w:val="24"/>
                 <w:szCs w:val="24"/>
               </w:rPr>
-              <w:t>Aspirations</w:t>
+              <w:t>Opportunities</w:t>
             </w:r>
             <w:r>
               <w:rPr>
@@ -1594,7 +1594,7 @@
                 <w:sz w:val="24"/>
                 <w:szCs w:val="24"/>
               </w:rPr>
-              <w:t>Results</w:t>
+              <w:t>Threats</w:t>
             </w:r>
           </w:p>
         </w:tc>
@@ -1799,6 +1799,7 @@
           <w:ilvl w:val="0"/>
           <w:numId w:val="2"/>
         </w:numPr>
+        <w:ind w:left="1080"/>
         <w:rPr>
           <w:rFonts w:ascii="Arial" w:hAnsi="Arial" w:cs="Arial"/>
           <w:sz w:val="24"/>
@@ -1821,6 +1822,7 @@
           <w:ilvl w:val="0"/>
           <w:numId w:val="2"/>
         </w:numPr>
+        <w:ind w:left="1080"/>
         <w:rPr>
           <w:rFonts w:ascii="Arial" w:hAnsi="Arial" w:cs="Arial"/>
           <w:sz w:val="24"/>
@@ -1843,6 +1845,7 @@
           <w:ilvl w:val="0"/>
           <w:numId w:val="2"/>
         </w:numPr>
+        <w:ind w:left="1080"/>
         <w:rPr>
           <w:rFonts w:ascii="Arial" w:hAnsi="Arial" w:cs="Arial"/>
           <w:sz w:val="24"/>
@@ -1873,7 +1876,7 @@
           <w:sz w:val="24"/>
           <w:szCs w:val="24"/>
         </w:rPr>
-        <w:t>To help you, you may research cyber security jobs adverts and descriptions</w:t>
+        <w:t>To help you, you may research cyber security job adverts and descriptions</w:t>
       </w:r>
       <w:r>
         <w:rPr>
@@ -1889,31 +1892,23 @@
           <w:sz w:val="24"/>
           <w:szCs w:val="24"/>
         </w:rPr>
-        <w:t xml:space="preserve"> </w:t>
-      </w:r>
-      <w:r>
-        <w:rPr>
-          <w:rFonts w:ascii="Arial" w:hAnsi="Arial" w:cs="Arial"/>
-          <w:sz w:val="24"/>
-          <w:szCs w:val="24"/>
-        </w:rPr>
-        <w:t>or if you’re already employed in a firm with cyber security staff</w:t>
-      </w:r>
-      <w:r>
-        <w:rPr>
-          <w:rFonts w:ascii="Arial" w:hAnsi="Arial" w:cs="Arial"/>
-          <w:sz w:val="24"/>
-          <w:szCs w:val="24"/>
-        </w:rPr>
-        <w:t xml:space="preserve">, </w:t>
-      </w:r>
-      <w:r>
-        <w:rPr>
-          <w:rFonts w:ascii="Arial" w:hAnsi="Arial" w:cs="Arial"/>
-          <w:sz w:val="24"/>
-          <w:szCs w:val="24"/>
-        </w:rPr>
-        <w:t>you could ask them.</w:t>
+        <w:t xml:space="preserve"> or if you’re already employed in a firm with cyber security staff</w:t>
+      </w:r>
+      <w:r>
+        <w:rPr>
+          <w:rFonts w:ascii="Arial" w:hAnsi="Arial" w:cs="Arial"/>
+          <w:sz w:val="24"/>
+          <w:szCs w:val="24"/>
+        </w:rPr>
+        <w:t>,</w:t>
+      </w:r>
+      <w:r>
+        <w:rPr>
+          <w:rFonts w:ascii="Arial" w:hAnsi="Arial" w:cs="Arial"/>
+          <w:sz w:val="24"/>
+          <w:szCs w:val="24"/>
+        </w:rPr>
+        <w:t xml:space="preserve"> you could ask them.</w:t>
       </w:r>
     </w:p>
     <w:tbl>
@@ -2061,31 +2056,7 @@
           <w:szCs w:val="24"/>
         </w:rPr>
         <w:lastRenderedPageBreak/>
-        <w:t>Finally create a personal development plan</w:t>
-      </w:r>
-      <w:r>
-        <w:rPr>
-          <w:rFonts w:ascii="Arial" w:hAnsi="Arial" w:cs="Arial"/>
-          <w:sz w:val="24"/>
-          <w:szCs w:val="24"/>
-        </w:rPr>
-        <w:t xml:space="preserve"> that includes how you will address areas for development that you’ve identified in the above questions</w:t>
-      </w:r>
-      <w:r>
-        <w:rPr>
-          <w:rFonts w:ascii="Arial" w:hAnsi="Arial" w:cs="Arial"/>
-          <w:sz w:val="24"/>
-          <w:szCs w:val="24"/>
-        </w:rPr>
-        <w:t xml:space="preserve">. Ensure that this is SMART and does not </w:t>
-      </w:r>
-      <w:r>
-        <w:rPr>
-          <w:rFonts w:ascii="Arial" w:hAnsi="Arial" w:cs="Arial"/>
-          <w:sz w:val="24"/>
-          <w:szCs w:val="24"/>
-        </w:rPr>
-        <w:t>include goals that are too large or too far in the future</w:t>
+        <w:t>Finally create a personal development plan that includes how you will address areas for development that you’ve identified in the above questions. Ensure that this is SMART and does not include goals that are too large or too far in the future</w:t>
       </w:r>
       <w:r>
         <w:rPr>

</xml_diff>